<commit_message>
Add credit policy: one tier's fee credits forward, no stacking
Both scope sheets (Stewardship Map, Permit Path Scan) and the workbook's
offer ladder now state the credit policy in plain language: a paid tier
credits toward the next engagement, but credits don't stack — up to one
tier's fee credits forward. Keeps entry risk low without eroding follow-on
margin.

https://claude.ai/code/session_01NNVRfcBeiW4jRftzrwemzW
</commit_message>
<xml_diff>
--- a/docs/business/final_deck/PublicLogic - Permit Path Scan - Scope & Fee Sheet.docx
+++ b/docs/business/final_deck/PublicLogic - Permit Path Scan - Scope & Fee Sheet.docx
@@ -436,7 +436,7 @@
     </w:p>
     <w:p>
       <w:pPr>
-        <w:spacing w:before="40" w:after="120" w:line="252" w:lineRule="auto"/>
+        <w:spacing w:before="40" w:after="20" w:line="252" w:lineRule="auto"/>
         <w:jc w:val="left"/>
       </w:pPr>
       <w:r>
@@ -447,7 +447,33 @@
           <w:color w:val="6B6660"/>
           <w:sz w:val="19"/>
         </w:rPr>
-        <w:t>Turnaround: a few business days. The Scan is triage, not a guarantee — it points you at the most likely path so you can move with confidence; the permitting authority always makes the final call. If you go on to a Stewardship Map, the Scan fee credits toward it.</w:t>
+        <w:t>Turnaround: a few business days. The Scan is triage, not a guarantee — it points you at the most likely path so you can move with confidence; the permitting authority always makes the final call.</w:t>
+      </w:r>
+    </w:p>
+    <w:p>
+      <w:pPr>
+        <w:spacing w:before="40" w:after="120" w:line="252" w:lineRule="auto"/>
+        <w:jc w:val="left"/>
+      </w:pPr>
+      <w:r>
+        <w:rPr>
+          <w:rFonts w:ascii="Calibri" w:hAnsi="Calibri"/>
+          <w:b/>
+          <w:i w:val="0"/>
+          <w:color w:val="0F4C3A"/>
+          <w:sz w:val="19"/>
+        </w:rPr>
+        <w:t xml:space="preserve">Credit policy:  </w:t>
+      </w:r>
+      <w:r>
+        <w:rPr>
+          <w:rFonts w:ascii="Calibri" w:hAnsi="Calibri"/>
+          <w:b w:val="0"/>
+          <w:i/>
+          <w:color w:val="6B6660"/>
+          <w:sz w:val="19"/>
+        </w:rPr>
+        <w:t>if you go on to a Stewardship Map, the Scan fee credits toward it. Credits don't stack — up to one tier's fee credits forward, so you never pay twice for the same step.</w:t>
       </w:r>
     </w:p>
     <w:p>

</xml_diff>

<commit_message>
Fee sheets: deliverables + proof; add The Path one-page visual
- Stewardship Map / Permit Path Scan: add explicit deliverables incl.
  "Recommended Next Step", and a one-line, no-names PROOF statement each.
- Sharpen the Scan's deliverables (Likely Path Summary / Boards & Offices /
  Permits & Approvals / Documents Needed / Recommended Next Step).
- Add build_path_diagram.py -> "The Path (one-page visual)": LogicCommons
  (Understand) -> Permit & Bridge (Navigate) -> Stewardship Map (Diagnose)
  -> PublicLogic (Deliver), on a Continuity & Stewardship Systems foundation
  ("the plumbing, not a product"). The diagram that goes everywhere.
- Refresh the v1 stack zip.

https://claude.ai/code/session_01NNVRfcBeiW4jRftzrwemzW
</commit_message>
<xml_diff>
--- a/docs/business/final_deck/PublicLogic - Permit Path Scan - Scope & Fee Sheet.docx
+++ b/docs/business/final_deck/PublicLogic - Permit Path Scan - Scope & Fee Sheet.docx
@@ -269,7 +269,7 @@
                 <w:color w:val="FFFFFF"/>
                 <w:sz w:val="20"/>
               </w:rPr>
-              <w:t>Likely Path</w:t>
+              <w:t>Likely Path Summary</w:t>
             </w:r>
           </w:p>
         </w:tc>
@@ -303,7 +303,7 @@
                 <w:color w:val="FFFFFF"/>
                 <w:sz w:val="20"/>
               </w:rPr>
-              <w:t>First Contact</w:t>
+              <w:t>Likely Boards / Offices</w:t>
             </w:r>
           </w:p>
         </w:tc>
@@ -318,7 +318,7 @@
                 <w:color w:val="1A1D20"/>
                 <w:sz w:val="20"/>
               </w:rPr>
-              <w:t>The specific board, office, or person to start with.</w:t>
+              <w:t>Which boards or offices will likely be involved, and who to start with.</w:t>
             </w:r>
           </w:p>
         </w:tc>
@@ -337,7 +337,41 @@
                 <w:color w:val="FFFFFF"/>
                 <w:sz w:val="20"/>
               </w:rPr>
-              <w:t>Document Checklist</w:t>
+              <w:t>Likely Permits / Approvals</w:t>
+            </w:r>
+          </w:p>
+        </w:tc>
+        <w:tc>
+          <w:tcPr>
+            <w:tcW w:type="dxa" w:w="7200"/>
+          </w:tcPr>
+          <w:p>
+            <w:r>
+              <w:rPr>
+                <w:rFonts w:ascii="Calibri" w:hAnsi="Calibri"/>
+                <w:color w:val="1A1D20"/>
+                <w:sz w:val="20"/>
+              </w:rPr>
+              <w:t>The permits, variances, or approvals you'll probably need.</w:t>
+            </w:r>
+          </w:p>
+        </w:tc>
+      </w:tr>
+      <w:tr>
+        <w:tc>
+          <w:tcPr>
+            <w:tcW w:type="dxa" w:w="2736"/>
+            <w:shd w:val="clear" w:fill="0F4C3A"/>
+          </w:tcPr>
+          <w:p>
+            <w:r>
+              <w:rPr>
+                <w:rFonts w:ascii="Calibri" w:hAnsi="Calibri"/>
+                <w:b/>
+                <w:color w:val="FFFFFF"/>
+                <w:sz w:val="20"/>
+              </w:rPr>
+              <w:t>Likely Documents Needed</w:t>
             </w:r>
           </w:p>
         </w:tc>
@@ -371,7 +405,7 @@
                 <w:color w:val="FFFFFF"/>
                 <w:sz w:val="20"/>
               </w:rPr>
-              <w:t>Watch-outs</w:t>
+              <w:t>Recommended Next Step</w:t>
             </w:r>
           </w:p>
         </w:tc>
@@ -386,7 +420,7 @@
                 <w:color w:val="1A1D20"/>
                 <w:sz w:val="20"/>
               </w:rPr>
-              <w:t>The common places this kind of request stalls.</w:t>
+              <w:t>The single best first move — and the common places this kind of request stalls.</w:t>
             </w:r>
           </w:p>
         </w:tc>
@@ -494,7 +528,7 @@
     </w:p>
     <w:p>
       <w:pPr>
-        <w:spacing w:before="40" w:after="160" w:line="252" w:lineRule="auto"/>
+        <w:spacing w:before="40" w:after="120" w:line="252" w:lineRule="auto"/>
         <w:jc w:val="left"/>
       </w:pPr>
       <w:r>
@@ -516,6 +550,38 @@
           <w:sz w:val="21"/>
         </w:rPr>
         <w:t>It helps you ask better questions, gather the right information, and avoid wasting time and money on the wrong path.</w:t>
+      </w:r>
+    </w:p>
+    <w:p>
+      <w:pPr>
+        <w:spacing w:before="40" w:after="20" w:line="252" w:lineRule="auto"/>
+        <w:jc w:val="left"/>
+      </w:pPr>
+      <w:r>
+        <w:rPr>
+          <w:rFonts w:ascii="Calibri" w:hAnsi="Calibri"/>
+          <w:b/>
+          <w:i w:val="0"/>
+          <w:color w:val="0F4C3A"/>
+          <w:sz w:val="20"/>
+        </w:rPr>
+        <w:t>PROOF</w:t>
+      </w:r>
+    </w:p>
+    <w:p>
+      <w:pPr>
+        <w:spacing w:before="40" w:after="160" w:line="252" w:lineRule="auto"/>
+        <w:jc w:val="left"/>
+      </w:pPr>
+      <w:r>
+        <w:rPr>
+          <w:rFonts w:ascii="Calibri" w:hAnsi="Calibri"/>
+          <w:b w:val="0"/>
+          <w:i/>
+          <w:color w:val="1A1D20"/>
+          <w:sz w:val="20"/>
+        </w:rPr>
+        <w:t>Similar reviews have helped project sponsors understand permitting, stakeholder, and board pathways before committing significant time and money.</w:t>
       </w:r>
     </w:p>
     <w:p>

</xml_diff>